<commit_message>
further small corrections in training dataset
</commit_message>
<xml_diff>
--- a/training/MSR_framework_training_EN.docx
+++ b/training/MSR_framework_training_EN.docx
@@ -2766,7 +2766,7 @@
           <w:color w:val="07BCE3" w:themeColor="accent5" w:themeShade="BF"/>
           <w:lang w:val="en-US"/>
         </w:rPr>
-        <w:t>env_update</w:t>
+        <w:t>env</w:t>
       </w:r>
       <w:r>
         <w:rPr>
@@ -2975,7 +2975,7 @@
           <w:color w:val="808080" w:themeColor="background1" w:themeShade="80"/>
           <w:lang w:val="en-US"/>
         </w:rPr>
-        <w:t>mrs_env_update</w:t>
+        <w:t>msr_env</w:t>
       </w:r>
       <w:proofErr w:type="spellEnd"/>
       <w:r>
@@ -3052,17 +3052,7 @@
           <w:color w:val="808080" w:themeColor="background1" w:themeShade="80"/>
           <w:lang w:val="en-US"/>
         </w:rPr>
-        <w:t>mrs_env</w:t>
-      </w:r>
-      <w:r>
-        <w:rPr>
-          <w:rFonts w:ascii="Garamond" w:hAnsi="Garamond"/>
-          <w:i/>
-          <w:iCs/>
-          <w:color w:val="808080" w:themeColor="background1" w:themeShade="80"/>
-          <w:lang w:val="en-US"/>
-        </w:rPr>
-        <w:t>_update</w:t>
+        <w:t>msr_env</w:t>
       </w:r>
       <w:proofErr w:type="spellEnd"/>
     </w:p>
@@ -3182,16 +3172,6 @@
           <w:lang w:val="en-US"/>
         </w:rPr>
         <w:t>_env</w:t>
-      </w:r>
-      <w:r>
-        <w:rPr>
-          <w:rFonts w:ascii="Garamond" w:hAnsi="Garamond"/>
-          <w:i/>
-          <w:iCs/>
-          <w:color w:val="07BCE3" w:themeColor="accent5" w:themeShade="BF"/>
-          <w:lang w:val="en-US"/>
-        </w:rPr>
-        <w:t>_update</w:t>
       </w:r>
       <w:proofErr w:type="spellEnd"/>
       <w:r>
@@ -9473,7 +9453,7 @@
         </w:rPr>
         <w:lastRenderedPageBreak/>
         <w:drawing>
-          <wp:inline distT="0" distB="0" distL="0" distR="0" wp14:anchorId="5D2A6092" wp14:editId="7BAC92CE">
+          <wp:inline distT="0" distB="0" distL="0" distR="0" wp14:anchorId="5D2A6092" wp14:editId="17D46AF4">
             <wp:extent cx="5725795" cy="2320925"/>
             <wp:effectExtent l="0" t="0" r="8255" b="3175"/>
             <wp:docPr id="872326584" name="Picture 2"/>
@@ -10176,7 +10156,7 @@
           <w:lang w:val="en-US"/>
         </w:rPr>
         <w:drawing>
-          <wp:inline distT="0" distB="0" distL="0" distR="0" wp14:anchorId="7DF1563D" wp14:editId="06AED1A0">
+          <wp:inline distT="0" distB="0" distL="0" distR="0" wp14:anchorId="7DF1563D" wp14:editId="59186480">
             <wp:extent cx="4923692" cy="2074427"/>
             <wp:effectExtent l="0" t="0" r="0" b="2540"/>
             <wp:docPr id="2075218623" name="Picture 3"/>
@@ -13585,7 +13565,7 @@
           <w:noProof/>
         </w:rPr>
         <w:drawing>
-          <wp:inline distT="0" distB="0" distL="0" distR="0" wp14:anchorId="3C266C2A" wp14:editId="23837F13">
+          <wp:inline distT="0" distB="0" distL="0" distR="0" wp14:anchorId="3C266C2A" wp14:editId="4316B487">
             <wp:extent cx="3416300" cy="2271095"/>
             <wp:effectExtent l="0" t="0" r="0" b="0"/>
             <wp:docPr id="1712662771" name="Picture 18"/>
@@ -15644,7 +15624,7 @@
           <w:lang w:val="en-US"/>
         </w:rPr>
         <w:drawing>
-          <wp:inline distT="0" distB="0" distL="0" distR="0" wp14:anchorId="4D499EA3" wp14:editId="1EC5C0D5">
+          <wp:inline distT="0" distB="0" distL="0" distR="0" wp14:anchorId="4D499EA3" wp14:editId="3433D247">
             <wp:extent cx="3435914" cy="2381250"/>
             <wp:effectExtent l="0" t="0" r="0" b="0"/>
             <wp:docPr id="1429674699" name="Picture 19"/>
@@ -16563,7 +16543,7 @@
         </w:rPr>
         <w:lastRenderedPageBreak/>
         <w:drawing>
-          <wp:inline distT="0" distB="0" distL="0" distR="0" wp14:anchorId="00F48468" wp14:editId="4408C04A">
+          <wp:inline distT="0" distB="0" distL="0" distR="0" wp14:anchorId="00F48468" wp14:editId="53490AE5">
             <wp:extent cx="3196424" cy="2124926"/>
             <wp:effectExtent l="0" t="0" r="4445" b="8890"/>
             <wp:docPr id="1170893738" name="Picture 21"/>
@@ -20893,7 +20873,7 @@
           <w:lang w:val="en-US"/>
         </w:rPr>
         <w:drawing>
-          <wp:inline distT="0" distB="0" distL="0" distR="0" wp14:anchorId="67B731F2" wp14:editId="042CC185">
+          <wp:inline distT="0" distB="0" distL="0" distR="0" wp14:anchorId="67B731F2" wp14:editId="05957F80">
             <wp:extent cx="5725160" cy="2305685"/>
             <wp:effectExtent l="0" t="0" r="8890" b="0"/>
             <wp:docPr id="1945377732" name="Picture 5"/>
@@ -30663,7 +30643,7 @@
           <w:lang w:val="en-US"/>
         </w:rPr>
         <w:drawing>
-          <wp:inline distT="0" distB="0" distL="0" distR="0" wp14:anchorId="5CCC5114" wp14:editId="718E890E">
+          <wp:inline distT="0" distB="0" distL="0" distR="0" wp14:anchorId="5CCC5114" wp14:editId="4F3D8148">
             <wp:extent cx="4283612" cy="1462708"/>
             <wp:effectExtent l="0" t="0" r="3175" b="4445"/>
             <wp:docPr id="1685984751" name="Picture 17"/>

</xml_diff>